<commit_message>
motivation avec beta et n
</commit_message>
<xml_diff>
--- a/Projet Thèse/contribution modèle.docx
+++ b/Projet Thèse/contribution modèle.docx
@@ -1180,37 +1180,17 @@
           <w:b/>
           <w:bCs/>
         </w:rPr>
-        <w:t>Ui=Vi−c+ϕ(n)−θi(n/T)</w:t>
-      </w:r>
-      <w:r>
-        <w:rPr>
-          <w:b/>
-          <w:bCs/>
-          <w:vertAlign w:val="superscript"/>
-        </w:rPr>
-        <w:t>α</w:t>
-      </w:r>
-      <w:r>
-        <w:rPr/>
-        <w:t xml:space="preserve"> </w:t>
-      </w:r>
-    </w:p>
-    <w:p>
-      <w:pPr>
-        <w:pStyle w:val="BodyText"/>
-        <w:rPr/>
-      </w:pPr>
-      <w:r>
-        <w:rPr/>
-        <w:t>où θi représente la sensibilité individuelle à la réactance et T le niveau de confiance institutionnelle. Dans une application réelle, ces paramètres individuels ne sont pas directement observables mais peuvent être estimés grâce à des données collectées en amont d'une campagne. Un questionnaire auprès de la population cible permettrait notamment d'approcher les motivations intrinsèques des individus (Vi), leur sensibilité au contrôle ou à l'influence externe (θi​), ainsi que leur niveau de confiance envers l'institution porteuse de la campagne (T). Ces informations permettrai</w:t>
-      </w:r>
-      <w:r>
-        <w:rPr/>
-        <w:t>en</w:t>
-      </w:r>
-      <w:r>
-        <w:rPr/>
-        <w:t>t alors d'estimer les distributions de la population, puis de simuler différents scénarios d'intervention. En faisant varier l'intensité de la campagne n, le modèle permettrait d'identifier la zone dans laquelle l'effet positif de l'intervention domine les coûts psychologiques associés, mais également de détecter l'apparition d'un seuil au-delà duquel une intensification supplémentaire devient contre-productive. Le modèle ne cherche donc pas à prédire individuellement le comportement d'un agent précis, mais à fournir un outil d'aide à la décision permettant d'évaluer ex ante la probabilité d'adoption d'une campagne selon les caractéristiques de la population ciblée et le niveau d'intervention envisagé.</w:t>
+        <w:t>Ui=a * [ Vi0​+ΔV(1−e−βnT)  – ( c – ø(n)) - θi * (n/T)α]</w:t>
+      </w:r>
+    </w:p>
+    <w:p>
+      <w:pPr>
+        <w:pStyle w:val="BodyText"/>
+        <w:rPr/>
+      </w:pPr>
+      <w:r>
+        <w:rPr/>
+        <w:t>où θi représente la sensibilité individuelle à la réactance et T le niveau de confiance institutionnelle. Dans une application réelle, ces paramètres individuels ne sont pas directement observables mais peuvent être estimés grâce à des données collectées en amont d'une campagne. Un questionnaire auprès de la population cible permettrait notamment d'approcher les motivations intrinsèques des individus (Vi), leur sensibilité au contrôle ou à l'influence externe (θi​), ainsi que leur niveau de confiance envers l'institution porteuse de la campagne (T). Ces informations permettraient alors d'estimer les distributions de la population, puis de simuler différents scénarios d'intervention. En faisant varier l'intensité de la campagne n, le modèle permettrait d'identifier la zone dans laquelle l'effet positif de l'intervention domine les coûts psychologiques associés, mais également de détecter l'apparition d'un seuil au-delà duquel une intensification supplémentaire devient contre-productive. Le modèle ne cherche donc pas à prédire individuellement le comportement d'un agent précis, mais à fournir un outil d'aide à la décision permettant d'évaluer ex ante la probabilité d'adoption d'une campagne selon les caractéristiques de la population ciblée et le niveau d'intervention envisagé.</w:t>
       </w:r>
     </w:p>
     <w:p>

</xml_diff>